<commit_message>
Add presentation files and overhaul README
</commit_message>
<xml_diff>
--- a/Enlace_y_presentación/Repo y presentación - Enlaces_Grupo #1_IA_Sección_10.docx
+++ b/Enlace_y_presentación/Repo y presentación - Enlaces_Grupo #1_IA_Sección_10.docx
@@ -2242,6 +2242,9 @@
                         <wps:txbx>
                           <w:txbxContent>
                             <w:p>
+                              <w:pPr>
+                                <w:jc w:val="center"/>
+                              </w:pPr>
                               <w:hyperlink r:id="rId7" w:history="1">
                                 <w:r>
                                   <w:rPr>
@@ -2704,12 +2707,15 @@
                         <wps:txbx>
                           <w:txbxContent>
                             <w:p>
+                              <w:pPr>
+                                <w:jc w:val="center"/>
+                              </w:pPr>
                               <w:hyperlink r:id="rId9" w:history="1">
                                 <w:r>
                                   <w:rPr>
                                     <w:rStyle w:val="Hipervnculo"/>
                                   </w:rPr>
-                                  <w:t>https://www.canva.com/design/DAHBtM3hbD4/qWE7iVbRPjjf9GNKZv-3LA/edit?utm_content=DAHBtM3hbD4&amp;utm_campaign=designshare&amp;utm_medium=link2&amp;utm_source=sharebutton</w:t>
+                                  <w:t>https://canva.link/muwhn4ww4l1eyue</w:t>
                                 </w:r>
                               </w:hyperlink>
                             </w:p>
@@ -3977,6 +3983,9 @@
                   <v:textbox inset="0,0,0,0">
                     <w:txbxContent>
                       <w:p>
+                        <w:pPr>
+                          <w:jc w:val="center"/>
+                        </w:pPr>
                         <w:hyperlink r:id="rId11" w:history="1">
                           <w:r>
                             <w:rPr>
@@ -4201,12 +4210,15 @@
                   <v:textbox inset="0,0,0,0">
                     <w:txbxContent>
                       <w:p>
+                        <w:pPr>
+                          <w:jc w:val="center"/>
+                        </w:pPr>
                         <w:hyperlink r:id="rId13" w:history="1">
                           <w:r>
                             <w:rPr>
                               <w:rStyle w:val="Hipervnculo"/>
                             </w:rPr>
-                            <w:t>https://www.canva.com/design/DAHBtM3hbD4/qWE7iVbRPjjf9GNKZv-3LA/edit?utm_content=DAHBtM3hbD4&amp;utm_campaign=designshare&amp;utm_medium=link2&amp;utm_source=sharebutton</w:t>
+                            <w:t>https://canva.link/muwhn4ww4l1eyue</w:t>
                           </w:r>
                         </w:hyperlink>
                       </w:p>

</xml_diff>